<commit_message>
Valida a base de dados no PostgreSQL 16 e adiciona docker-compose
- docker-compose.yml: sobe o PostgreSQL 16 já com esquema, dados e views;
- scripts/testar_postgres.py: confere 21 tabelas, 4 views e 345 linhas, roda o
  CRUD completo e os testes de integridade no servidor;
- testes/test_integridade_postgres.sql: 14 comandos inválidos que o banco
  precisa recusar (todos recusados);
- documentação e Word atualizados: o PostgreSQL foi testado de verdade.
</commit_message>
<xml_diff>
--- a/banco-de-dados/docs/Documentacao-Banco-de-Dados.docx
+++ b/banco-de-dados/docs/Documentacao-Banco-de-Dados.docx
@@ -480,7 +480,23 @@
                 <w:i w:val="0"/>
                 <w:sz w:val="18"/>
               </w:rPr>
-              <w:t>: 23 testes automáticos (criação, dados, CRUD e regras de integridade)</w:t>
+              <w:t xml:space="preserve">: 23 testes automáticos no SQLite (criação, dados, CRUD e regras de integridade) e </w:t>
+            </w:r>
+            <w:r>
+              <w:rPr>
+                <w:rFonts w:ascii="Consolas" w:hAnsi="Consolas" w:eastAsia="Consolas"/>
+                <w:b w:val="0"/>
+                <w:sz w:val="16"/>
+              </w:rPr>
+              <w:t>scripts/testar_postgres.py</w:t>
+            </w:r>
+            <w:r>
+              <w:rPr>
+                <w:b w:val="0"/>
+                <w:i w:val="0"/>
+                <w:sz w:val="18"/>
+              </w:rPr>
+              <w:t>: a mesma verificação num servidor PostgreSQL 16 (Docker), que passou</w:t>
             </w:r>
           </w:p>
         </w:tc>
@@ -1529,10 +1545,17 @@
       </w:pPr>
       <w:r>
         <w:rPr>
+          <w:b/>
+          <w:i w:val="0"/>
+        </w:rPr>
+        <w:t>Os scripts de PostgreSQL foram executados num servidor PostgreSQL 16 (Docker) e passaram:</w:t>
+      </w:r>
+      <w:r>
+        <w:rPr>
           <w:b w:val="0"/>
           <w:i w:val="0"/>
         </w:rPr>
-        <w:t>Os scripts de PostgreSQL (</w:t>
+        <w:t xml:space="preserve"> as 21 tabelas, as 4 views e os 345 registros iniciais foram criados sem erro; o CRUD completo (</w:t>
       </w:r>
       <w:r>
         <w:rPr>
@@ -1540,14 +1563,14 @@
           <w:b w:val="0"/>
           <w:sz w:val="20"/>
         </w:rPr>
-        <w:t>sql/01_schema_postgres.sql</w:t>
+        <w:t>sql/04_crud_exemplos.sql</w:t>
       </w:r>
       <w:r>
         <w:rPr>
           <w:b w:val="0"/>
           <w:i w:val="0"/>
         </w:rPr>
-        <w:t xml:space="preserve"> e </w:t>
+        <w:t xml:space="preserve">) rodou e deixou o banco igual ao inicial; e o banco recusou os 14 comandos inválidos de </w:t>
       </w:r>
       <w:r>
         <w:rPr>
@@ -1555,28 +1578,14 @@
           <w:b w:val="0"/>
           <w:sz w:val="20"/>
         </w:rPr>
-        <w:t>sql/02b_ajustar_sequencias_postgres.sql</w:t>
+        <w:t>testes/test_integridade_postgres.sql</w:t>
       </w:r>
       <w:r>
         <w:rPr>
           <w:b w:val="0"/>
           <w:i w:val="0"/>
         </w:rPr>
-        <w:t xml:space="preserve">) ainda </w:t>
-      </w:r>
-      <w:r>
-        <w:rPr>
-          <w:b/>
-          <w:i w:val="0"/>
-        </w:rPr>
-        <w:t>não foram executados em um servidor PostgreSQL</w:t>
-      </w:r>
-      <w:r>
-        <w:rPr>
-          <w:b w:val="0"/>
-          <w:i w:val="0"/>
-        </w:rPr>
-        <w:t xml:space="preserve">. Isso fica como a primeira tarefa da próxima etapa, junto com o </w:t>
+        <w:t xml:space="preserve"> (chaves estrangeiras, valores únicos, regras CHECK, chave composta e RESTRICT). O </w:t>
       </w:r>
       <w:r>
         <w:rPr>
@@ -1584,14 +1593,72 @@
           <w:b w:val="0"/>
           <w:sz w:val="20"/>
         </w:rPr>
-        <w:t>docker-compose</w:t>
+        <w:t>docker-compose.yml</w:t>
       </w:r>
       <w:r>
         <w:rPr>
           <w:b w:val="0"/>
           <w:i w:val="0"/>
         </w:rPr>
-        <w:t xml:space="preserve"> para subir o banco com um comando.</w:t>
+        <w:t xml:space="preserve"> sobe o banco com um comando (</w:t>
+      </w:r>
+      <w:r>
+        <w:rPr>
+          <w:rFonts w:ascii="Consolas" w:hAnsi="Consolas" w:eastAsia="Consolas"/>
+          <w:b w:val="0"/>
+          <w:sz w:val="20"/>
+        </w:rPr>
+        <w:t>docker compose up -d</w:t>
+      </w:r>
+      <w:r>
+        <w:rPr>
+          <w:b w:val="0"/>
+          <w:i w:val="0"/>
+        </w:rPr>
+        <w:t xml:space="preserve">) e </w:t>
+      </w:r>
+      <w:r>
+        <w:rPr>
+          <w:rFonts w:ascii="Consolas" w:hAnsi="Consolas" w:eastAsia="Consolas"/>
+          <w:b w:val="0"/>
+          <w:sz w:val="20"/>
+        </w:rPr>
+        <w:t>scripts/testar_postgres.py</w:t>
+      </w:r>
+      <w:r>
+        <w:rPr>
+          <w:b w:val="0"/>
+          <w:i w:val="0"/>
+        </w:rPr>
+        <w:t xml:space="preserve"> repete essa verificação.</w:t>
+      </w:r>
+    </w:p>
+    <w:p>
+      <w:pPr>
+        <w:pStyle w:val="ListBullet"/>
+        <w:spacing w:after="60"/>
+      </w:pPr>
+      <w:r>
+        <w:rPr>
+          <w:b w:val="0"/>
+          <w:i w:val="0"/>
+        </w:rPr>
+        <w:t>A validação foi feita com o PostgreSQL 16.15 em contêiner Linux (Alpine). Os testes unitários em Python (</w:t>
+      </w:r>
+      <w:r>
+        <w:rPr>
+          <w:rFonts w:ascii="Consolas" w:hAnsi="Consolas" w:eastAsia="Consolas"/>
+          <w:b w:val="0"/>
+          <w:sz w:val="20"/>
+        </w:rPr>
+        <w:t>testes/test_banco.py</w:t>
+      </w:r>
+      <w:r>
+        <w:rPr>
+          <w:b w:val="0"/>
+          <w:i w:val="0"/>
+        </w:rPr>
+        <w:t>) continuam rodando no SQLite.</w:t>
       </w:r>
     </w:p>
     <w:p>
@@ -31080,7 +31147,37 @@
           <w:b w:val="0"/>
           <w:i w:val="0"/>
         </w:rPr>
-        <w:t xml:space="preserve">: </w:t>
+        <w:t xml:space="preserve"> com Docker: </w:t>
+      </w:r>
+      <w:r>
+        <w:rPr>
+          <w:rFonts w:ascii="Consolas" w:hAnsi="Consolas" w:eastAsia="Consolas"/>
+          <w:b w:val="0"/>
+          <w:sz w:val="20"/>
+        </w:rPr>
+        <w:t>docker compose up -d</w:t>
+      </w:r>
+      <w:r>
+        <w:rPr>
+          <w:b w:val="0"/>
+          <w:i w:val="0"/>
+        </w:rPr>
+        <w:t xml:space="preserve"> (sobe o servidor e já cria tudo) e </w:t>
+      </w:r>
+      <w:r>
+        <w:rPr>
+          <w:rFonts w:ascii="Consolas" w:hAnsi="Consolas" w:eastAsia="Consolas"/>
+          <w:b w:val="0"/>
+          <w:sz w:val="20"/>
+        </w:rPr>
+        <w:t>python scripts/testar_postgres.py</w:t>
+      </w:r>
+      <w:r>
+        <w:rPr>
+          <w:b w:val="0"/>
+          <w:i w:val="0"/>
+        </w:rPr>
+        <w:t xml:space="preserve"> (confere as tabelas, roda o CRUD completo e os testes de integridade). Num PostgreSQL já instalado: </w:t>
       </w:r>
       <w:r>
         <w:rPr>

</xml_diff>

<commit_message>
Refaz o DER com linhas retas, adiciona o PDF e ajusta a capa
- scripts/gerar_der.py e layouts_der.py: desenham os DER com linhas
  horizontais e verticais e tabelas organizadas (visao geral, completo
  e um diagrama por modulo);
- documento em PDF (30 paginas) alem do Word;
- capa no padrao do TCC (Arial 12 negrito, preto) e documento sem cores;
- README atualizado.
</commit_message>
<xml_diff>
--- a/banco-de-dados/docs/Documentacao-Banco-de-Dados.docx
+++ b/banco-de-dados/docs/Documentacao-Banco-de-Dados.docx
@@ -4,117 +4,100 @@
   <w:body>
     <w:p>
       <w:pPr>
-        <w:spacing w:after="80"/>
+        <w:spacing w:before="0" w:after="0" w:line="360" w:lineRule="auto"/>
         <w:jc w:val="center"/>
       </w:pPr>
       <w:r>
         <w:rPr>
+          <w:rFonts w:ascii="Arial" w:hAnsi="Arial" w:eastAsia="Arial"/>
           <w:b/>
-          <w:i w:val="0"/>
-          <w:color w:val="17232E"/>
-          <w:sz w:val="26"/>
+          <w:sz w:val="24"/>
         </w:rPr>
         <w:t>FACULDADE DE TECNOLOGIA DE COTIA</w:t>
       </w:r>
     </w:p>
     <w:p>
       <w:pPr>
-        <w:spacing w:after="1800"/>
+        <w:spacing w:before="2180" w:after="0" w:line="360" w:lineRule="auto"/>
         <w:jc w:val="center"/>
       </w:pPr>
       <w:r>
         <w:rPr>
-          <w:b w:val="0"/>
-          <w:i w:val="0"/>
-          <w:sz w:val="22"/>
+          <w:rFonts w:ascii="Arial" w:hAnsi="Arial" w:eastAsia="Arial"/>
+          <w:b/>
+          <w:sz w:val="24"/>
         </w:rPr>
-        <w:t>Disciplina de PLN · Prof. Braz Izaias da Silva Junior</w:t>
+        <w:t>ENZO FERNANDES</w:t>
       </w:r>
     </w:p>
     <w:p>
       <w:pPr>
-        <w:spacing w:after="200"/>
+        <w:spacing w:before="0" w:after="0" w:line="360" w:lineRule="auto"/>
         <w:jc w:val="center"/>
       </w:pPr>
       <w:r>
         <w:rPr>
+          <w:rFonts w:ascii="Arial" w:hAnsi="Arial" w:eastAsia="Arial"/>
           <w:b/>
-          <w:i w:val="0"/>
-          <w:color w:val="1C7293"/>
-          <w:sz w:val="60"/>
+          <w:sz w:val="24"/>
         </w:rPr>
-        <w:t>DIGITAL TWIN INDUSTRIAL</w:t>
+        <w:t>VICTOR RAFAEL DE OLIVEIRA DIAS</w:t>
       </w:r>
     </w:p>
     <w:p>
       <w:pPr>
-        <w:spacing w:after="120"/>
+        <w:spacing w:before="3460" w:after="0" w:line="360" w:lineRule="auto"/>
         <w:jc w:val="center"/>
       </w:pPr>
       <w:r>
         <w:rPr>
+          <w:rFonts w:ascii="Arial" w:hAnsi="Arial" w:eastAsia="Arial"/>
           <w:b/>
-          <w:i w:val="0"/>
-          <w:color w:val="17232E"/>
-          <w:sz w:val="36"/>
+          <w:sz w:val="24"/>
         </w:rPr>
-        <w:t>Base de dados: DER, modelagem e CRUD</w:t>
+        <w:t>DIGITAL TWIN INDUSTRIAL</w:t>
       </w:r>
     </w:p>
     <w:p>
       <w:pPr>
-        <w:spacing w:after="2200"/>
+        <w:spacing w:before="0" w:after="0" w:line="360" w:lineRule="auto"/>
         <w:jc w:val="center"/>
       </w:pPr>
       <w:r>
         <w:rPr>
-          <w:b w:val="0"/>
-          <w:i/>
+          <w:rFonts w:ascii="Arial" w:hAnsi="Arial" w:eastAsia="Arial"/>
+          <w:b/>
           <w:sz w:val="24"/>
         </w:rPr>
-        <w:t>Sprint 1 · Documentação da base de dados</w:t>
+        <w:t>BASE DE DADOS: DER, MODELAGEM E CRUD</w:t>
       </w:r>
     </w:p>
     <w:p>
       <w:pPr>
-        <w:spacing w:after="40"/>
+        <w:spacing w:before="4780" w:after="0" w:line="360" w:lineRule="auto"/>
         <w:jc w:val="center"/>
       </w:pPr>
       <w:r>
         <w:rPr>
-          <w:b w:val="0"/>
-          <w:i w:val="0"/>
+          <w:rFonts w:ascii="Arial" w:hAnsi="Arial" w:eastAsia="Arial"/>
+          <w:b/>
           <w:sz w:val="24"/>
         </w:rPr>
-        <w:t>Victor Rafael de Oliveira Dias</w:t>
+        <w:t>Cotia - SP</w:t>
       </w:r>
     </w:p>
     <w:p>
       <w:pPr>
-        <w:spacing w:after="1800"/>
+        <w:spacing w:before="0" w:after="0" w:line="360" w:lineRule="auto"/>
         <w:jc w:val="center"/>
       </w:pPr>
       <w:r>
         <w:rPr>
-          <w:b w:val="0"/>
-          <w:i w:val="0"/>
+          <w:rFonts w:ascii="Arial" w:hAnsi="Arial" w:eastAsia="Arial"/>
+          <w:b/>
           <w:sz w:val="24"/>
         </w:rPr>
-        <w:t>Enzo Fernandes</w:t>
-      </w:r>
-    </w:p>
-    <w:p>
-      <w:pPr>
-        <w:spacing w:after="0"/>
-        <w:jc w:val="center"/>
-      </w:pPr>
-      <w:r>
-        <w:rPr>
-          <w:b w:val="0"/>
-          <w:i w:val="0"/>
-          <w:sz w:val="22"/>
-        </w:rPr>
-        <w:t>Cotia - SP · 2026</w:t>
+        <w:t>2026</w:t>
       </w:r>
     </w:p>
     <w:p>
@@ -124,7 +107,7 @@
       <w:r>
         <w:rPr>
           <w:b/>
-          <w:color w:val="17232E"/>
+          <w:color w:val="000000"/>
           <w:sz w:val="30"/>
         </w:rPr>
         <w:t>Sumário</w:t>
@@ -215,7 +198,7 @@
         <w:tc>
           <w:tcPr>
             <w:tcW w:type="dxa" w:w="2835"/>
-            <w:shd w:val="clear" w:color="auto" w:fill="E3F0F4"/>
+            <w:shd w:val="clear" w:color="auto" w:fill="E7E7E7"/>
           </w:tcPr>
           <w:p>
             <w:pPr>
@@ -235,7 +218,7 @@
         <w:tc>
           <w:tcPr>
             <w:tcW w:type="dxa" w:w="6236"/>
-            <w:shd w:val="clear" w:color="auto" w:fill="E3F0F4"/>
+            <w:shd w:val="clear" w:color="auto" w:fill="E7E7E7"/>
           </w:tcPr>
           <w:p>
             <w:pPr>
@@ -638,7 +621,7 @@
         <w:tc>
           <w:tcPr>
             <w:tcW w:type="dxa" w:w="2381"/>
-            <w:shd w:val="clear" w:color="auto" w:fill="E3F0F4"/>
+            <w:shd w:val="clear" w:color="auto" w:fill="E7E7E7"/>
           </w:tcPr>
           <w:p>
             <w:pPr>
@@ -658,7 +641,7 @@
         <w:tc>
           <w:tcPr>
             <w:tcW w:type="dxa" w:w="2381"/>
-            <w:shd w:val="clear" w:color="auto" w:fill="E3F0F4"/>
+            <w:shd w:val="clear" w:color="auto" w:fill="E7E7E7"/>
           </w:tcPr>
           <w:p>
             <w:pPr>
@@ -678,7 +661,7 @@
         <w:tc>
           <w:tcPr>
             <w:tcW w:type="dxa" w:w="2268"/>
-            <w:shd w:val="clear" w:color="auto" w:fill="E3F0F4"/>
+            <w:shd w:val="clear" w:color="auto" w:fill="E7E7E7"/>
           </w:tcPr>
           <w:p>
             <w:pPr>
@@ -698,7 +681,7 @@
         <w:tc>
           <w:tcPr>
             <w:tcW w:type="dxa" w:w="2041"/>
-            <w:shd w:val="clear" w:color="auto" w:fill="E3F0F4"/>
+            <w:shd w:val="clear" w:color="auto" w:fill="E7E7E7"/>
           </w:tcPr>
           <w:p>
             <w:pPr>
@@ -1701,7 +1684,7 @@
         <w:tc>
           <w:tcPr>
             <w:tcW w:type="dxa" w:w="3024"/>
-            <w:shd w:val="clear" w:color="auto" w:fill="E3F0F4"/>
+            <w:shd w:val="clear" w:color="auto" w:fill="E7E7E7"/>
           </w:tcPr>
           <w:p>
             <w:pPr>
@@ -1721,7 +1704,7 @@
         <w:tc>
           <w:tcPr>
             <w:tcW w:type="dxa" w:w="3024"/>
-            <w:shd w:val="clear" w:color="auto" w:fill="E3F0F4"/>
+            <w:shd w:val="clear" w:color="auto" w:fill="E7E7E7"/>
           </w:tcPr>
           <w:p>
             <w:pPr>
@@ -1741,7 +1724,7 @@
         <w:tc>
           <w:tcPr>
             <w:tcW w:type="dxa" w:w="3024"/>
-            <w:shd w:val="clear" w:color="auto" w:fill="E3F0F4"/>
+            <w:shd w:val="clear" w:color="auto" w:fill="E7E7E7"/>
           </w:tcPr>
           <w:p>
             <w:pPr>
@@ -2700,7 +2683,7 @@
         <w:tc>
           <w:tcPr>
             <w:tcW w:type="dxa" w:w="3024"/>
-            <w:shd w:val="clear" w:color="auto" w:fill="E3F0F4"/>
+            <w:shd w:val="clear" w:color="auto" w:fill="E7E7E7"/>
           </w:tcPr>
           <w:p>
             <w:pPr>
@@ -2720,7 +2703,7 @@
         <w:tc>
           <w:tcPr>
             <w:tcW w:type="dxa" w:w="3024"/>
-            <w:shd w:val="clear" w:color="auto" w:fill="E3F0F4"/>
+            <w:shd w:val="clear" w:color="auto" w:fill="E7E7E7"/>
           </w:tcPr>
           <w:p>
             <w:pPr>
@@ -2740,7 +2723,7 @@
         <w:tc>
           <w:tcPr>
             <w:tcW w:type="dxa" w:w="3024"/>
-            <w:shd w:val="clear" w:color="auto" w:fill="E3F0F4"/>
+            <w:shd w:val="clear" w:color="auto" w:fill="E7E7E7"/>
           </w:tcPr>
           <w:p>
             <w:pPr>
@@ -4066,7 +4049,7 @@
         <w:tc>
           <w:tcPr>
             <w:tcW w:type="dxa" w:w="4535"/>
-            <w:shd w:val="clear" w:color="auto" w:fill="E3F0F4"/>
+            <w:shd w:val="clear" w:color="auto" w:fill="E7E7E7"/>
           </w:tcPr>
           <w:p>
             <w:pPr>
@@ -4086,7 +4069,7 @@
         <w:tc>
           <w:tcPr>
             <w:tcW w:type="dxa" w:w="4535"/>
-            <w:shd w:val="clear" w:color="auto" w:fill="E3F0F4"/>
+            <w:shd w:val="clear" w:color="auto" w:fill="E7E7E7"/>
           </w:tcPr>
           <w:p>
             <w:pPr>
@@ -4654,6 +4637,7 @@
           <w:pgSz w:w="11906" w:h="16838"/>
           <w:pgMar w:top="1701" w:right="1134" w:bottom="1134" w:left="1701" w:header="720" w:footer="720" w:gutter="0"/>
           <w:cols w:space="720"/>
+          <w:titlePg/>
           <w:docGrid w:linePitch="360"/>
         </w:sectPr>
       </w:pPr>
@@ -4674,7 +4658,7 @@
       <w:r>
         <w:drawing>
           <wp:inline xmlns:a="http://schemas.openxmlformats.org/drawingml/2006/main" xmlns:pic="http://schemas.openxmlformats.org/drawingml/2006/picture">
-            <wp:extent cx="9180000" cy="3025732"/>
+            <wp:extent cx="7392513" cy="4608000"/>
             <wp:docPr id="1" name="Picture 1"/>
             <wp:cNvGraphicFramePr>
               <a:graphicFrameLocks noChangeAspect="1"/>
@@ -4695,7 +4679,7 @@
                   <pic:spPr>
                     <a:xfrm>
                       <a:off x="0" y="0"/>
-                      <a:ext cx="9180000" cy="3025732"/>
+                      <a:ext cx="7392513" cy="4608000"/>
                     </a:xfrm>
                     <a:prstGeom prst="rect"/>
                   </pic:spPr>
@@ -4725,6 +4709,7 @@
           <w:pgSz w:w="16838" w:h="11906" w:orient="landscape"/>
           <w:pgMar w:top="1134" w:right="1134" w:bottom="1134" w:left="1134" w:header="720" w:footer="720" w:gutter="0"/>
           <w:cols w:space="720"/>
+          <w:titlePg/>
           <w:docGrid w:linePitch="360"/>
         </w:sectPr>
       </w:pPr>
@@ -4745,7 +4730,7 @@
       <w:r>
         <w:drawing>
           <wp:inline xmlns:a="http://schemas.openxmlformats.org/drawingml/2006/main" xmlns:pic="http://schemas.openxmlformats.org/drawingml/2006/picture">
-            <wp:extent cx="5760000" cy="2350080"/>
+            <wp:extent cx="5760000" cy="4262400"/>
             <wp:docPr id="2" name="Picture 2"/>
             <wp:cNvGraphicFramePr>
               <a:graphicFrameLocks noChangeAspect="1"/>
@@ -4766,7 +4751,7 @@
                   <pic:spPr>
                     <a:xfrm>
                       <a:off x="0" y="0"/>
-                      <a:ext cx="5760000" cy="2350080"/>
+                      <a:ext cx="5760000" cy="4262400"/>
                     </a:xfrm>
                     <a:prstGeom prst="rect"/>
                   </pic:spPr>
@@ -4806,7 +4791,7 @@
       <w:r>
         <w:drawing>
           <wp:inline xmlns:a="http://schemas.openxmlformats.org/drawingml/2006/main" xmlns:pic="http://schemas.openxmlformats.org/drawingml/2006/picture">
-            <wp:extent cx="5760000" cy="5997338"/>
+            <wp:extent cx="5760000" cy="4951779"/>
             <wp:docPr id="3" name="Picture 3"/>
             <wp:cNvGraphicFramePr>
               <a:graphicFrameLocks noChangeAspect="1"/>
@@ -4827,7 +4812,7 @@
                   <pic:spPr>
                     <a:xfrm>
                       <a:off x="0" y="0"/>
-                      <a:ext cx="5760000" cy="5997338"/>
+                      <a:ext cx="5760000" cy="4951779"/>
                     </a:xfrm>
                     <a:prstGeom prst="rect"/>
                   </pic:spPr>
@@ -4867,7 +4852,7 @@
       <w:r>
         <w:drawing>
           <wp:inline xmlns:a="http://schemas.openxmlformats.org/drawingml/2006/main" xmlns:pic="http://schemas.openxmlformats.org/drawingml/2006/picture">
-            <wp:extent cx="5760000" cy="6766080"/>
+            <wp:extent cx="5760000" cy="2829176"/>
             <wp:docPr id="4" name="Picture 4"/>
             <wp:cNvGraphicFramePr>
               <a:graphicFrameLocks noChangeAspect="1"/>
@@ -4888,7 +4873,7 @@
                   <pic:spPr>
                     <a:xfrm>
                       <a:off x="0" y="0"/>
-                      <a:ext cx="5760000" cy="6766080"/>
+                      <a:ext cx="5760000" cy="2829176"/>
                     </a:xfrm>
                     <a:prstGeom prst="rect"/>
                   </pic:spPr>
@@ -4928,7 +4913,7 @@
       <w:r>
         <w:drawing>
           <wp:inline xmlns:a="http://schemas.openxmlformats.org/drawingml/2006/main" xmlns:pic="http://schemas.openxmlformats.org/drawingml/2006/picture">
-            <wp:extent cx="3917004" cy="7740000"/>
+            <wp:extent cx="5760000" cy="4377600"/>
             <wp:docPr id="5" name="Picture 5"/>
             <wp:cNvGraphicFramePr>
               <a:graphicFrameLocks noChangeAspect="1"/>
@@ -4949,7 +4934,7 @@
                   <pic:spPr>
                     <a:xfrm>
                       <a:off x="0" y="0"/>
-                      <a:ext cx="3917004" cy="7740000"/>
+                      <a:ext cx="5760000" cy="4377600"/>
                     </a:xfrm>
                     <a:prstGeom prst="rect"/>
                   </pic:spPr>
@@ -4989,7 +4974,7 @@
       <w:r>
         <w:drawing>
           <wp:inline xmlns:a="http://schemas.openxmlformats.org/drawingml/2006/main" xmlns:pic="http://schemas.openxmlformats.org/drawingml/2006/picture">
-            <wp:extent cx="5760000" cy="6908325"/>
+            <wp:extent cx="5760000" cy="5441590"/>
             <wp:docPr id="6" name="Picture 6"/>
             <wp:cNvGraphicFramePr>
               <a:graphicFrameLocks noChangeAspect="1"/>
@@ -5010,7 +4995,7 @@
                   <pic:spPr>
                     <a:xfrm>
                       <a:off x="0" y="0"/>
-                      <a:ext cx="5760000" cy="6908325"/>
+                      <a:ext cx="5760000" cy="5441590"/>
                     </a:xfrm>
                     <a:prstGeom prst="rect"/>
                   </pic:spPr>
@@ -5778,7 +5763,7 @@
         <w:tc>
           <w:tcPr>
             <w:tcW w:type="dxa" w:w="1247"/>
-            <w:shd w:val="clear" w:color="auto" w:fill="E3F0F4"/>
+            <w:shd w:val="clear" w:color="auto" w:fill="E7E7E7"/>
           </w:tcPr>
           <w:p>
             <w:pPr>
@@ -5798,7 +5783,7 @@
         <w:tc>
           <w:tcPr>
             <w:tcW w:type="dxa" w:w="3061"/>
-            <w:shd w:val="clear" w:color="auto" w:fill="E3F0F4"/>
+            <w:shd w:val="clear" w:color="auto" w:fill="E7E7E7"/>
           </w:tcPr>
           <w:p>
             <w:pPr>
@@ -5818,7 +5803,7 @@
         <w:tc>
           <w:tcPr>
             <w:tcW w:type="dxa" w:w="4762"/>
-            <w:shd w:val="clear" w:color="auto" w:fill="E3F0F4"/>
+            <w:shd w:val="clear" w:color="auto" w:fill="E7E7E7"/>
           </w:tcPr>
           <w:p>
             <w:pPr>
@@ -6626,7 +6611,7 @@
         <w:tc>
           <w:tcPr>
             <w:tcW w:type="dxa" w:w="1701"/>
-            <w:shd w:val="clear" w:color="auto" w:fill="E3F0F4"/>
+            <w:shd w:val="clear" w:color="auto" w:fill="E7E7E7"/>
           </w:tcPr>
           <w:p>
             <w:pPr>
@@ -6646,7 +6631,7 @@
         <w:tc>
           <w:tcPr>
             <w:tcW w:type="dxa" w:w="1304"/>
-            <w:shd w:val="clear" w:color="auto" w:fill="E3F0F4"/>
+            <w:shd w:val="clear" w:color="auto" w:fill="E7E7E7"/>
           </w:tcPr>
           <w:p>
             <w:pPr>
@@ -6666,7 +6651,7 @@
         <w:tc>
           <w:tcPr>
             <w:tcW w:type="dxa" w:w="2154"/>
-            <w:shd w:val="clear" w:color="auto" w:fill="E3F0F4"/>
+            <w:shd w:val="clear" w:color="auto" w:fill="E7E7E7"/>
           </w:tcPr>
           <w:p>
             <w:pPr>
@@ -6686,7 +6671,7 @@
         <w:tc>
           <w:tcPr>
             <w:tcW w:type="dxa" w:w="907"/>
-            <w:shd w:val="clear" w:color="auto" w:fill="E3F0F4"/>
+            <w:shd w:val="clear" w:color="auto" w:fill="E7E7E7"/>
           </w:tcPr>
           <w:p>
             <w:pPr>
@@ -6706,7 +6691,7 @@
         <w:tc>
           <w:tcPr>
             <w:tcW w:type="dxa" w:w="907"/>
-            <w:shd w:val="clear" w:color="auto" w:fill="E3F0F4"/>
+            <w:shd w:val="clear" w:color="auto" w:fill="E7E7E7"/>
           </w:tcPr>
           <w:p>
             <w:pPr>
@@ -6726,7 +6711,7 @@
         <w:tc>
           <w:tcPr>
             <w:tcW w:type="dxa" w:w="2098"/>
-            <w:shd w:val="clear" w:color="auto" w:fill="E3F0F4"/>
+            <w:shd w:val="clear" w:color="auto" w:fill="E7E7E7"/>
           </w:tcPr>
           <w:p>
             <w:pPr>
@@ -7532,7 +7517,7 @@
         <w:tc>
           <w:tcPr>
             <w:tcW w:type="dxa" w:w="1701"/>
-            <w:shd w:val="clear" w:color="auto" w:fill="E3F0F4"/>
+            <w:shd w:val="clear" w:color="auto" w:fill="E7E7E7"/>
           </w:tcPr>
           <w:p>
             <w:pPr>
@@ -7552,7 +7537,7 @@
         <w:tc>
           <w:tcPr>
             <w:tcW w:type="dxa" w:w="1304"/>
-            <w:shd w:val="clear" w:color="auto" w:fill="E3F0F4"/>
+            <w:shd w:val="clear" w:color="auto" w:fill="E7E7E7"/>
           </w:tcPr>
           <w:p>
             <w:pPr>
@@ -7572,7 +7557,7 @@
         <w:tc>
           <w:tcPr>
             <w:tcW w:type="dxa" w:w="2154"/>
-            <w:shd w:val="clear" w:color="auto" w:fill="E3F0F4"/>
+            <w:shd w:val="clear" w:color="auto" w:fill="E7E7E7"/>
           </w:tcPr>
           <w:p>
             <w:pPr>
@@ -7592,7 +7577,7 @@
         <w:tc>
           <w:tcPr>
             <w:tcW w:type="dxa" w:w="907"/>
-            <w:shd w:val="clear" w:color="auto" w:fill="E3F0F4"/>
+            <w:shd w:val="clear" w:color="auto" w:fill="E7E7E7"/>
           </w:tcPr>
           <w:p>
             <w:pPr>
@@ -7612,7 +7597,7 @@
         <w:tc>
           <w:tcPr>
             <w:tcW w:type="dxa" w:w="907"/>
-            <w:shd w:val="clear" w:color="auto" w:fill="E3F0F4"/>
+            <w:shd w:val="clear" w:color="auto" w:fill="E7E7E7"/>
           </w:tcPr>
           <w:p>
             <w:pPr>
@@ -7632,7 +7617,7 @@
         <w:tc>
           <w:tcPr>
             <w:tcW w:type="dxa" w:w="2098"/>
-            <w:shd w:val="clear" w:color="auto" w:fill="E3F0F4"/>
+            <w:shd w:val="clear" w:color="auto" w:fill="E7E7E7"/>
           </w:tcPr>
           <w:p>
             <w:pPr>
@@ -8430,7 +8415,7 @@
         <w:tc>
           <w:tcPr>
             <w:tcW w:type="dxa" w:w="1701"/>
-            <w:shd w:val="clear" w:color="auto" w:fill="E3F0F4"/>
+            <w:shd w:val="clear" w:color="auto" w:fill="E7E7E7"/>
           </w:tcPr>
           <w:p>
             <w:pPr>
@@ -8450,7 +8435,7 @@
         <w:tc>
           <w:tcPr>
             <w:tcW w:type="dxa" w:w="1304"/>
-            <w:shd w:val="clear" w:color="auto" w:fill="E3F0F4"/>
+            <w:shd w:val="clear" w:color="auto" w:fill="E7E7E7"/>
           </w:tcPr>
           <w:p>
             <w:pPr>
@@ -8470,7 +8455,7 @@
         <w:tc>
           <w:tcPr>
             <w:tcW w:type="dxa" w:w="2154"/>
-            <w:shd w:val="clear" w:color="auto" w:fill="E3F0F4"/>
+            <w:shd w:val="clear" w:color="auto" w:fill="E7E7E7"/>
           </w:tcPr>
           <w:p>
             <w:pPr>
@@ -8490,7 +8475,7 @@
         <w:tc>
           <w:tcPr>
             <w:tcW w:type="dxa" w:w="907"/>
-            <w:shd w:val="clear" w:color="auto" w:fill="E3F0F4"/>
+            <w:shd w:val="clear" w:color="auto" w:fill="E7E7E7"/>
           </w:tcPr>
           <w:p>
             <w:pPr>
@@ -8510,7 +8495,7 @@
         <w:tc>
           <w:tcPr>
             <w:tcW w:type="dxa" w:w="907"/>
-            <w:shd w:val="clear" w:color="auto" w:fill="E3F0F4"/>
+            <w:shd w:val="clear" w:color="auto" w:fill="E7E7E7"/>
           </w:tcPr>
           <w:p>
             <w:pPr>
@@ -8530,7 +8515,7 @@
         <w:tc>
           <w:tcPr>
             <w:tcW w:type="dxa" w:w="2098"/>
-            <w:shd w:val="clear" w:color="auto" w:fill="E3F0F4"/>
+            <w:shd w:val="clear" w:color="auto" w:fill="E7E7E7"/>
           </w:tcPr>
           <w:p>
             <w:pPr>
@@ -8967,7 +8952,7 @@
         <w:tc>
           <w:tcPr>
             <w:tcW w:type="dxa" w:w="1701"/>
-            <w:shd w:val="clear" w:color="auto" w:fill="E3F0F4"/>
+            <w:shd w:val="clear" w:color="auto" w:fill="E7E7E7"/>
           </w:tcPr>
           <w:p>
             <w:pPr>
@@ -8987,7 +8972,7 @@
         <w:tc>
           <w:tcPr>
             <w:tcW w:type="dxa" w:w="1304"/>
-            <w:shd w:val="clear" w:color="auto" w:fill="E3F0F4"/>
+            <w:shd w:val="clear" w:color="auto" w:fill="E7E7E7"/>
           </w:tcPr>
           <w:p>
             <w:pPr>
@@ -9007,7 +8992,7 @@
         <w:tc>
           <w:tcPr>
             <w:tcW w:type="dxa" w:w="2154"/>
-            <w:shd w:val="clear" w:color="auto" w:fill="E3F0F4"/>
+            <w:shd w:val="clear" w:color="auto" w:fill="E7E7E7"/>
           </w:tcPr>
           <w:p>
             <w:pPr>
@@ -9027,7 +9012,7 @@
         <w:tc>
           <w:tcPr>
             <w:tcW w:type="dxa" w:w="907"/>
-            <w:shd w:val="clear" w:color="auto" w:fill="E3F0F4"/>
+            <w:shd w:val="clear" w:color="auto" w:fill="E7E7E7"/>
           </w:tcPr>
           <w:p>
             <w:pPr>
@@ -9047,7 +9032,7 @@
         <w:tc>
           <w:tcPr>
             <w:tcW w:type="dxa" w:w="907"/>
-            <w:shd w:val="clear" w:color="auto" w:fill="E3F0F4"/>
+            <w:shd w:val="clear" w:color="auto" w:fill="E7E7E7"/>
           </w:tcPr>
           <w:p>
             <w:pPr>
@@ -9067,7 +9052,7 @@
         <w:tc>
           <w:tcPr>
             <w:tcW w:type="dxa" w:w="2098"/>
-            <w:shd w:val="clear" w:color="auto" w:fill="E3F0F4"/>
+            <w:shd w:val="clear" w:color="auto" w:fill="E7E7E7"/>
           </w:tcPr>
           <w:p>
             <w:pPr>
@@ -11995,7 +11980,7 @@
         <w:tc>
           <w:tcPr>
             <w:tcW w:type="dxa" w:w="1701"/>
-            <w:shd w:val="clear" w:color="auto" w:fill="E3F0F4"/>
+            <w:shd w:val="clear" w:color="auto" w:fill="E7E7E7"/>
           </w:tcPr>
           <w:p>
             <w:pPr>
@@ -12015,7 +12000,7 @@
         <w:tc>
           <w:tcPr>
             <w:tcW w:type="dxa" w:w="1304"/>
-            <w:shd w:val="clear" w:color="auto" w:fill="E3F0F4"/>
+            <w:shd w:val="clear" w:color="auto" w:fill="E7E7E7"/>
           </w:tcPr>
           <w:p>
             <w:pPr>
@@ -12035,7 +12020,7 @@
         <w:tc>
           <w:tcPr>
             <w:tcW w:type="dxa" w:w="2154"/>
-            <w:shd w:val="clear" w:color="auto" w:fill="E3F0F4"/>
+            <w:shd w:val="clear" w:color="auto" w:fill="E7E7E7"/>
           </w:tcPr>
           <w:p>
             <w:pPr>
@@ -12055,7 +12040,7 @@
         <w:tc>
           <w:tcPr>
             <w:tcW w:type="dxa" w:w="907"/>
-            <w:shd w:val="clear" w:color="auto" w:fill="E3F0F4"/>
+            <w:shd w:val="clear" w:color="auto" w:fill="E7E7E7"/>
           </w:tcPr>
           <w:p>
             <w:pPr>
@@ -12075,7 +12060,7 @@
         <w:tc>
           <w:tcPr>
             <w:tcW w:type="dxa" w:w="907"/>
-            <w:shd w:val="clear" w:color="auto" w:fill="E3F0F4"/>
+            <w:shd w:val="clear" w:color="auto" w:fill="E7E7E7"/>
           </w:tcPr>
           <w:p>
             <w:pPr>
@@ -12095,7 +12080,7 @@
         <w:tc>
           <w:tcPr>
             <w:tcW w:type="dxa" w:w="2098"/>
-            <w:shd w:val="clear" w:color="auto" w:fill="E3F0F4"/>
+            <w:shd w:val="clear" w:color="auto" w:fill="E7E7E7"/>
           </w:tcPr>
           <w:p>
             <w:pPr>
@@ -12569,7 +12554,7 @@
         <w:tc>
           <w:tcPr>
             <w:tcW w:type="dxa" w:w="1701"/>
-            <w:shd w:val="clear" w:color="auto" w:fill="E3F0F4"/>
+            <w:shd w:val="clear" w:color="auto" w:fill="E7E7E7"/>
           </w:tcPr>
           <w:p>
             <w:pPr>
@@ -12589,7 +12574,7 @@
         <w:tc>
           <w:tcPr>
             <w:tcW w:type="dxa" w:w="1304"/>
-            <w:shd w:val="clear" w:color="auto" w:fill="E3F0F4"/>
+            <w:shd w:val="clear" w:color="auto" w:fill="E7E7E7"/>
           </w:tcPr>
           <w:p>
             <w:pPr>
@@ -12609,7 +12594,7 @@
         <w:tc>
           <w:tcPr>
             <w:tcW w:type="dxa" w:w="2154"/>
-            <w:shd w:val="clear" w:color="auto" w:fill="E3F0F4"/>
+            <w:shd w:val="clear" w:color="auto" w:fill="E7E7E7"/>
           </w:tcPr>
           <w:p>
             <w:pPr>
@@ -12629,7 +12614,7 @@
         <w:tc>
           <w:tcPr>
             <w:tcW w:type="dxa" w:w="907"/>
-            <w:shd w:val="clear" w:color="auto" w:fill="E3F0F4"/>
+            <w:shd w:val="clear" w:color="auto" w:fill="E7E7E7"/>
           </w:tcPr>
           <w:p>
             <w:pPr>
@@ -12649,7 +12634,7 @@
         <w:tc>
           <w:tcPr>
             <w:tcW w:type="dxa" w:w="907"/>
-            <w:shd w:val="clear" w:color="auto" w:fill="E3F0F4"/>
+            <w:shd w:val="clear" w:color="auto" w:fill="E7E7E7"/>
           </w:tcPr>
           <w:p>
             <w:pPr>
@@ -12669,7 +12654,7 @@
         <w:tc>
           <w:tcPr>
             <w:tcW w:type="dxa" w:w="2098"/>
-            <w:shd w:val="clear" w:color="auto" w:fill="E3F0F4"/>
+            <w:shd w:val="clear" w:color="auto" w:fill="E7E7E7"/>
           </w:tcPr>
           <w:p>
             <w:pPr>
@@ -13414,7 +13399,7 @@
         <w:tc>
           <w:tcPr>
             <w:tcW w:type="dxa" w:w="1701"/>
-            <w:shd w:val="clear" w:color="auto" w:fill="E3F0F4"/>
+            <w:shd w:val="clear" w:color="auto" w:fill="E7E7E7"/>
           </w:tcPr>
           <w:p>
             <w:pPr>
@@ -13434,7 +13419,7 @@
         <w:tc>
           <w:tcPr>
             <w:tcW w:type="dxa" w:w="1304"/>
-            <w:shd w:val="clear" w:color="auto" w:fill="E3F0F4"/>
+            <w:shd w:val="clear" w:color="auto" w:fill="E7E7E7"/>
           </w:tcPr>
           <w:p>
             <w:pPr>
@@ -13454,7 +13439,7 @@
         <w:tc>
           <w:tcPr>
             <w:tcW w:type="dxa" w:w="2154"/>
-            <w:shd w:val="clear" w:color="auto" w:fill="E3F0F4"/>
+            <w:shd w:val="clear" w:color="auto" w:fill="E7E7E7"/>
           </w:tcPr>
           <w:p>
             <w:pPr>
@@ -13474,7 +13459,7 @@
         <w:tc>
           <w:tcPr>
             <w:tcW w:type="dxa" w:w="907"/>
-            <w:shd w:val="clear" w:color="auto" w:fill="E3F0F4"/>
+            <w:shd w:val="clear" w:color="auto" w:fill="E7E7E7"/>
           </w:tcPr>
           <w:p>
             <w:pPr>
@@ -13494,7 +13479,7 @@
         <w:tc>
           <w:tcPr>
             <w:tcW w:type="dxa" w:w="907"/>
-            <w:shd w:val="clear" w:color="auto" w:fill="E3F0F4"/>
+            <w:shd w:val="clear" w:color="auto" w:fill="E7E7E7"/>
           </w:tcPr>
           <w:p>
             <w:pPr>
@@ -13514,7 +13499,7 @@
         <w:tc>
           <w:tcPr>
             <w:tcW w:type="dxa" w:w="2098"/>
-            <w:shd w:val="clear" w:color="auto" w:fill="E3F0F4"/>
+            <w:shd w:val="clear" w:color="auto" w:fill="E7E7E7"/>
           </w:tcPr>
           <w:p>
             <w:pPr>
@@ -13979,7 +13964,7 @@
         <w:tc>
           <w:tcPr>
             <w:tcW w:type="dxa" w:w="1701"/>
-            <w:shd w:val="clear" w:color="auto" w:fill="E3F0F4"/>
+            <w:shd w:val="clear" w:color="auto" w:fill="E7E7E7"/>
           </w:tcPr>
           <w:p>
             <w:pPr>
@@ -13999,7 +13984,7 @@
         <w:tc>
           <w:tcPr>
             <w:tcW w:type="dxa" w:w="1304"/>
-            <w:shd w:val="clear" w:color="auto" w:fill="E3F0F4"/>
+            <w:shd w:val="clear" w:color="auto" w:fill="E7E7E7"/>
           </w:tcPr>
           <w:p>
             <w:pPr>
@@ -14019,7 +14004,7 @@
         <w:tc>
           <w:tcPr>
             <w:tcW w:type="dxa" w:w="2154"/>
-            <w:shd w:val="clear" w:color="auto" w:fill="E3F0F4"/>
+            <w:shd w:val="clear" w:color="auto" w:fill="E7E7E7"/>
           </w:tcPr>
           <w:p>
             <w:pPr>
@@ -14039,7 +14024,7 @@
         <w:tc>
           <w:tcPr>
             <w:tcW w:type="dxa" w:w="907"/>
-            <w:shd w:val="clear" w:color="auto" w:fill="E3F0F4"/>
+            <w:shd w:val="clear" w:color="auto" w:fill="E7E7E7"/>
           </w:tcPr>
           <w:p>
             <w:pPr>
@@ -14059,7 +14044,7 @@
         <w:tc>
           <w:tcPr>
             <w:tcW w:type="dxa" w:w="907"/>
-            <w:shd w:val="clear" w:color="auto" w:fill="E3F0F4"/>
+            <w:shd w:val="clear" w:color="auto" w:fill="E7E7E7"/>
           </w:tcPr>
           <w:p>
             <w:pPr>
@@ -14079,7 +14064,7 @@
         <w:tc>
           <w:tcPr>
             <w:tcW w:type="dxa" w:w="2098"/>
-            <w:shd w:val="clear" w:color="auto" w:fill="E3F0F4"/>
+            <w:shd w:val="clear" w:color="auto" w:fill="E7E7E7"/>
           </w:tcPr>
           <w:p>
             <w:pPr>
@@ -15060,7 +15045,7 @@
         <w:tc>
           <w:tcPr>
             <w:tcW w:type="dxa" w:w="1701"/>
-            <w:shd w:val="clear" w:color="auto" w:fill="E3F0F4"/>
+            <w:shd w:val="clear" w:color="auto" w:fill="E7E7E7"/>
           </w:tcPr>
           <w:p>
             <w:pPr>
@@ -15080,7 +15065,7 @@
         <w:tc>
           <w:tcPr>
             <w:tcW w:type="dxa" w:w="1304"/>
-            <w:shd w:val="clear" w:color="auto" w:fill="E3F0F4"/>
+            <w:shd w:val="clear" w:color="auto" w:fill="E7E7E7"/>
           </w:tcPr>
           <w:p>
             <w:pPr>
@@ -15100,7 +15085,7 @@
         <w:tc>
           <w:tcPr>
             <w:tcW w:type="dxa" w:w="2154"/>
-            <w:shd w:val="clear" w:color="auto" w:fill="E3F0F4"/>
+            <w:shd w:val="clear" w:color="auto" w:fill="E7E7E7"/>
           </w:tcPr>
           <w:p>
             <w:pPr>
@@ -15120,7 +15105,7 @@
         <w:tc>
           <w:tcPr>
             <w:tcW w:type="dxa" w:w="907"/>
-            <w:shd w:val="clear" w:color="auto" w:fill="E3F0F4"/>
+            <w:shd w:val="clear" w:color="auto" w:fill="E7E7E7"/>
           </w:tcPr>
           <w:p>
             <w:pPr>
@@ -15140,7 +15125,7 @@
         <w:tc>
           <w:tcPr>
             <w:tcW w:type="dxa" w:w="907"/>
-            <w:shd w:val="clear" w:color="auto" w:fill="E3F0F4"/>
+            <w:shd w:val="clear" w:color="auto" w:fill="E7E7E7"/>
           </w:tcPr>
           <w:p>
             <w:pPr>
@@ -15160,7 +15145,7 @@
         <w:tc>
           <w:tcPr>
             <w:tcW w:type="dxa" w:w="2098"/>
-            <w:shd w:val="clear" w:color="auto" w:fill="E3F0F4"/>
+            <w:shd w:val="clear" w:color="auto" w:fill="E7E7E7"/>
           </w:tcPr>
           <w:p>
             <w:pPr>
@@ -16376,7 +16361,7 @@
         <w:tc>
           <w:tcPr>
             <w:tcW w:type="dxa" w:w="1701"/>
-            <w:shd w:val="clear" w:color="auto" w:fill="E3F0F4"/>
+            <w:shd w:val="clear" w:color="auto" w:fill="E7E7E7"/>
           </w:tcPr>
           <w:p>
             <w:pPr>
@@ -16396,7 +16381,7 @@
         <w:tc>
           <w:tcPr>
             <w:tcW w:type="dxa" w:w="1304"/>
-            <w:shd w:val="clear" w:color="auto" w:fill="E3F0F4"/>
+            <w:shd w:val="clear" w:color="auto" w:fill="E7E7E7"/>
           </w:tcPr>
           <w:p>
             <w:pPr>
@@ -16416,7 +16401,7 @@
         <w:tc>
           <w:tcPr>
             <w:tcW w:type="dxa" w:w="2154"/>
-            <w:shd w:val="clear" w:color="auto" w:fill="E3F0F4"/>
+            <w:shd w:val="clear" w:color="auto" w:fill="E7E7E7"/>
           </w:tcPr>
           <w:p>
             <w:pPr>
@@ -16436,7 +16421,7 @@
         <w:tc>
           <w:tcPr>
             <w:tcW w:type="dxa" w:w="907"/>
-            <w:shd w:val="clear" w:color="auto" w:fill="E3F0F4"/>
+            <w:shd w:val="clear" w:color="auto" w:fill="E7E7E7"/>
           </w:tcPr>
           <w:p>
             <w:pPr>
@@ -16456,7 +16441,7 @@
         <w:tc>
           <w:tcPr>
             <w:tcW w:type="dxa" w:w="907"/>
-            <w:shd w:val="clear" w:color="auto" w:fill="E3F0F4"/>
+            <w:shd w:val="clear" w:color="auto" w:fill="E7E7E7"/>
           </w:tcPr>
           <w:p>
             <w:pPr>
@@ -16476,7 +16461,7 @@
         <w:tc>
           <w:tcPr>
             <w:tcW w:type="dxa" w:w="2098"/>
-            <w:shd w:val="clear" w:color="auto" w:fill="E3F0F4"/>
+            <w:shd w:val="clear" w:color="auto" w:fill="E7E7E7"/>
           </w:tcPr>
           <w:p>
             <w:pPr>
@@ -16958,7 +16943,7 @@
         <w:tc>
           <w:tcPr>
             <w:tcW w:type="dxa" w:w="1701"/>
-            <w:shd w:val="clear" w:color="auto" w:fill="E3F0F4"/>
+            <w:shd w:val="clear" w:color="auto" w:fill="E7E7E7"/>
           </w:tcPr>
           <w:p>
             <w:pPr>
@@ -16978,7 +16963,7 @@
         <w:tc>
           <w:tcPr>
             <w:tcW w:type="dxa" w:w="1304"/>
-            <w:shd w:val="clear" w:color="auto" w:fill="E3F0F4"/>
+            <w:shd w:val="clear" w:color="auto" w:fill="E7E7E7"/>
           </w:tcPr>
           <w:p>
             <w:pPr>
@@ -16998,7 +16983,7 @@
         <w:tc>
           <w:tcPr>
             <w:tcW w:type="dxa" w:w="2154"/>
-            <w:shd w:val="clear" w:color="auto" w:fill="E3F0F4"/>
+            <w:shd w:val="clear" w:color="auto" w:fill="E7E7E7"/>
           </w:tcPr>
           <w:p>
             <w:pPr>
@@ -17018,7 +17003,7 @@
         <w:tc>
           <w:tcPr>
             <w:tcW w:type="dxa" w:w="907"/>
-            <w:shd w:val="clear" w:color="auto" w:fill="E3F0F4"/>
+            <w:shd w:val="clear" w:color="auto" w:fill="E7E7E7"/>
           </w:tcPr>
           <w:p>
             <w:pPr>
@@ -17038,7 +17023,7 @@
         <w:tc>
           <w:tcPr>
             <w:tcW w:type="dxa" w:w="907"/>
-            <w:shd w:val="clear" w:color="auto" w:fill="E3F0F4"/>
+            <w:shd w:val="clear" w:color="auto" w:fill="E7E7E7"/>
           </w:tcPr>
           <w:p>
             <w:pPr>
@@ -17058,7 +17043,7 @@
         <w:tc>
           <w:tcPr>
             <w:tcW w:type="dxa" w:w="2098"/>
-            <w:shd w:val="clear" w:color="auto" w:fill="E3F0F4"/>
+            <w:shd w:val="clear" w:color="auto" w:fill="E7E7E7"/>
           </w:tcPr>
           <w:p>
             <w:pPr>
@@ -17468,7 +17453,7 @@
         <w:tc>
           <w:tcPr>
             <w:tcW w:type="dxa" w:w="1701"/>
-            <w:shd w:val="clear" w:color="auto" w:fill="E3F0F4"/>
+            <w:shd w:val="clear" w:color="auto" w:fill="E7E7E7"/>
           </w:tcPr>
           <w:p>
             <w:pPr>
@@ -17488,7 +17473,7 @@
         <w:tc>
           <w:tcPr>
             <w:tcW w:type="dxa" w:w="1304"/>
-            <w:shd w:val="clear" w:color="auto" w:fill="E3F0F4"/>
+            <w:shd w:val="clear" w:color="auto" w:fill="E7E7E7"/>
           </w:tcPr>
           <w:p>
             <w:pPr>
@@ -17508,7 +17493,7 @@
         <w:tc>
           <w:tcPr>
             <w:tcW w:type="dxa" w:w="2154"/>
-            <w:shd w:val="clear" w:color="auto" w:fill="E3F0F4"/>
+            <w:shd w:val="clear" w:color="auto" w:fill="E7E7E7"/>
           </w:tcPr>
           <w:p>
             <w:pPr>
@@ -17528,7 +17513,7 @@
         <w:tc>
           <w:tcPr>
             <w:tcW w:type="dxa" w:w="907"/>
-            <w:shd w:val="clear" w:color="auto" w:fill="E3F0F4"/>
+            <w:shd w:val="clear" w:color="auto" w:fill="E7E7E7"/>
           </w:tcPr>
           <w:p>
             <w:pPr>
@@ -17548,7 +17533,7 @@
         <w:tc>
           <w:tcPr>
             <w:tcW w:type="dxa" w:w="907"/>
-            <w:shd w:val="clear" w:color="auto" w:fill="E3F0F4"/>
+            <w:shd w:val="clear" w:color="auto" w:fill="E7E7E7"/>
           </w:tcPr>
           <w:p>
             <w:pPr>
@@ -17568,7 +17553,7 @@
         <w:tc>
           <w:tcPr>
             <w:tcW w:type="dxa" w:w="2098"/>
-            <w:shd w:val="clear" w:color="auto" w:fill="E3F0F4"/>
+            <w:shd w:val="clear" w:color="auto" w:fill="E7E7E7"/>
           </w:tcPr>
           <w:p>
             <w:pPr>
@@ -18349,7 +18334,7 @@
         <w:tc>
           <w:tcPr>
             <w:tcW w:type="dxa" w:w="1701"/>
-            <w:shd w:val="clear" w:color="auto" w:fill="E3F0F4"/>
+            <w:shd w:val="clear" w:color="auto" w:fill="E7E7E7"/>
           </w:tcPr>
           <w:p>
             <w:pPr>
@@ -18369,7 +18354,7 @@
         <w:tc>
           <w:tcPr>
             <w:tcW w:type="dxa" w:w="1304"/>
-            <w:shd w:val="clear" w:color="auto" w:fill="E3F0F4"/>
+            <w:shd w:val="clear" w:color="auto" w:fill="E7E7E7"/>
           </w:tcPr>
           <w:p>
             <w:pPr>
@@ -18389,7 +18374,7 @@
         <w:tc>
           <w:tcPr>
             <w:tcW w:type="dxa" w:w="2154"/>
-            <w:shd w:val="clear" w:color="auto" w:fill="E3F0F4"/>
+            <w:shd w:val="clear" w:color="auto" w:fill="E7E7E7"/>
           </w:tcPr>
           <w:p>
             <w:pPr>
@@ -18409,7 +18394,7 @@
         <w:tc>
           <w:tcPr>
             <w:tcW w:type="dxa" w:w="907"/>
-            <w:shd w:val="clear" w:color="auto" w:fill="E3F0F4"/>
+            <w:shd w:val="clear" w:color="auto" w:fill="E7E7E7"/>
           </w:tcPr>
           <w:p>
             <w:pPr>
@@ -18429,7 +18414,7 @@
         <w:tc>
           <w:tcPr>
             <w:tcW w:type="dxa" w:w="907"/>
-            <w:shd w:val="clear" w:color="auto" w:fill="E3F0F4"/>
+            <w:shd w:val="clear" w:color="auto" w:fill="E7E7E7"/>
           </w:tcPr>
           <w:p>
             <w:pPr>
@@ -18449,7 +18434,7 @@
         <w:tc>
           <w:tcPr>
             <w:tcW w:type="dxa" w:w="2098"/>
-            <w:shd w:val="clear" w:color="auto" w:fill="E3F0F4"/>
+            <w:shd w:val="clear" w:color="auto" w:fill="E7E7E7"/>
           </w:tcPr>
           <w:p>
             <w:pPr>
@@ -19675,7 +19660,7 @@
         <w:tc>
           <w:tcPr>
             <w:tcW w:type="dxa" w:w="1701"/>
-            <w:shd w:val="clear" w:color="auto" w:fill="E3F0F4"/>
+            <w:shd w:val="clear" w:color="auto" w:fill="E7E7E7"/>
           </w:tcPr>
           <w:p>
             <w:pPr>
@@ -19695,7 +19680,7 @@
         <w:tc>
           <w:tcPr>
             <w:tcW w:type="dxa" w:w="1304"/>
-            <w:shd w:val="clear" w:color="auto" w:fill="E3F0F4"/>
+            <w:shd w:val="clear" w:color="auto" w:fill="E7E7E7"/>
           </w:tcPr>
           <w:p>
             <w:pPr>
@@ -19715,7 +19700,7 @@
         <w:tc>
           <w:tcPr>
             <w:tcW w:type="dxa" w:w="2154"/>
-            <w:shd w:val="clear" w:color="auto" w:fill="E3F0F4"/>
+            <w:shd w:val="clear" w:color="auto" w:fill="E7E7E7"/>
           </w:tcPr>
           <w:p>
             <w:pPr>
@@ -19735,7 +19720,7 @@
         <w:tc>
           <w:tcPr>
             <w:tcW w:type="dxa" w:w="907"/>
-            <w:shd w:val="clear" w:color="auto" w:fill="E3F0F4"/>
+            <w:shd w:val="clear" w:color="auto" w:fill="E7E7E7"/>
           </w:tcPr>
           <w:p>
             <w:pPr>
@@ -19755,7 +19740,7 @@
         <w:tc>
           <w:tcPr>
             <w:tcW w:type="dxa" w:w="907"/>
-            <w:shd w:val="clear" w:color="auto" w:fill="E3F0F4"/>
+            <w:shd w:val="clear" w:color="auto" w:fill="E7E7E7"/>
           </w:tcPr>
           <w:p>
             <w:pPr>
@@ -19775,7 +19760,7 @@
         <w:tc>
           <w:tcPr>
             <w:tcW w:type="dxa" w:w="2098"/>
-            <w:shd w:val="clear" w:color="auto" w:fill="E3F0F4"/>
+            <w:shd w:val="clear" w:color="auto" w:fill="E7E7E7"/>
           </w:tcPr>
           <w:p>
             <w:pPr>
@@ -20916,7 +20901,7 @@
         <w:tc>
           <w:tcPr>
             <w:tcW w:type="dxa" w:w="1701"/>
-            <w:shd w:val="clear" w:color="auto" w:fill="E3F0F4"/>
+            <w:shd w:val="clear" w:color="auto" w:fill="E7E7E7"/>
           </w:tcPr>
           <w:p>
             <w:pPr>
@@ -20936,7 +20921,7 @@
         <w:tc>
           <w:tcPr>
             <w:tcW w:type="dxa" w:w="1304"/>
-            <w:shd w:val="clear" w:color="auto" w:fill="E3F0F4"/>
+            <w:shd w:val="clear" w:color="auto" w:fill="E7E7E7"/>
           </w:tcPr>
           <w:p>
             <w:pPr>
@@ -20956,7 +20941,7 @@
         <w:tc>
           <w:tcPr>
             <w:tcW w:type="dxa" w:w="2154"/>
-            <w:shd w:val="clear" w:color="auto" w:fill="E3F0F4"/>
+            <w:shd w:val="clear" w:color="auto" w:fill="E7E7E7"/>
           </w:tcPr>
           <w:p>
             <w:pPr>
@@ -20976,7 +20961,7 @@
         <w:tc>
           <w:tcPr>
             <w:tcW w:type="dxa" w:w="907"/>
-            <w:shd w:val="clear" w:color="auto" w:fill="E3F0F4"/>
+            <w:shd w:val="clear" w:color="auto" w:fill="E7E7E7"/>
           </w:tcPr>
           <w:p>
             <w:pPr>
@@ -20996,7 +20981,7 @@
         <w:tc>
           <w:tcPr>
             <w:tcW w:type="dxa" w:w="907"/>
-            <w:shd w:val="clear" w:color="auto" w:fill="E3F0F4"/>
+            <w:shd w:val="clear" w:color="auto" w:fill="E7E7E7"/>
           </w:tcPr>
           <w:p>
             <w:pPr>
@@ -21016,7 +21001,7 @@
         <w:tc>
           <w:tcPr>
             <w:tcW w:type="dxa" w:w="2098"/>
-            <w:shd w:val="clear" w:color="auto" w:fill="E3F0F4"/>
+            <w:shd w:val="clear" w:color="auto" w:fill="E7E7E7"/>
           </w:tcPr>
           <w:p>
             <w:pPr>
@@ -21785,7 +21770,7 @@
         <w:tc>
           <w:tcPr>
             <w:tcW w:type="dxa" w:w="1701"/>
-            <w:shd w:val="clear" w:color="auto" w:fill="E3F0F4"/>
+            <w:shd w:val="clear" w:color="auto" w:fill="E7E7E7"/>
           </w:tcPr>
           <w:p>
             <w:pPr>
@@ -21805,7 +21790,7 @@
         <w:tc>
           <w:tcPr>
             <w:tcW w:type="dxa" w:w="1304"/>
-            <w:shd w:val="clear" w:color="auto" w:fill="E3F0F4"/>
+            <w:shd w:val="clear" w:color="auto" w:fill="E7E7E7"/>
           </w:tcPr>
           <w:p>
             <w:pPr>
@@ -21825,7 +21810,7 @@
         <w:tc>
           <w:tcPr>
             <w:tcW w:type="dxa" w:w="2154"/>
-            <w:shd w:val="clear" w:color="auto" w:fill="E3F0F4"/>
+            <w:shd w:val="clear" w:color="auto" w:fill="E7E7E7"/>
           </w:tcPr>
           <w:p>
             <w:pPr>
@@ -21845,7 +21830,7 @@
         <w:tc>
           <w:tcPr>
             <w:tcW w:type="dxa" w:w="907"/>
-            <w:shd w:val="clear" w:color="auto" w:fill="E3F0F4"/>
+            <w:shd w:val="clear" w:color="auto" w:fill="E7E7E7"/>
           </w:tcPr>
           <w:p>
             <w:pPr>
@@ -21865,7 +21850,7 @@
         <w:tc>
           <w:tcPr>
             <w:tcW w:type="dxa" w:w="907"/>
-            <w:shd w:val="clear" w:color="auto" w:fill="E3F0F4"/>
+            <w:shd w:val="clear" w:color="auto" w:fill="E7E7E7"/>
           </w:tcPr>
           <w:p>
             <w:pPr>
@@ -21885,7 +21870,7 @@
         <w:tc>
           <w:tcPr>
             <w:tcW w:type="dxa" w:w="2098"/>
-            <w:shd w:val="clear" w:color="auto" w:fill="E3F0F4"/>
+            <w:shd w:val="clear" w:color="auto" w:fill="E7E7E7"/>
           </w:tcPr>
           <w:p>
             <w:pPr>
@@ -23001,7 +22986,7 @@
         <w:tc>
           <w:tcPr>
             <w:tcW w:type="dxa" w:w="1701"/>
-            <w:shd w:val="clear" w:color="auto" w:fill="E3F0F4"/>
+            <w:shd w:val="clear" w:color="auto" w:fill="E7E7E7"/>
           </w:tcPr>
           <w:p>
             <w:pPr>
@@ -23021,7 +23006,7 @@
         <w:tc>
           <w:tcPr>
             <w:tcW w:type="dxa" w:w="1304"/>
-            <w:shd w:val="clear" w:color="auto" w:fill="E3F0F4"/>
+            <w:shd w:val="clear" w:color="auto" w:fill="E7E7E7"/>
           </w:tcPr>
           <w:p>
             <w:pPr>
@@ -23041,7 +23026,7 @@
         <w:tc>
           <w:tcPr>
             <w:tcW w:type="dxa" w:w="2154"/>
-            <w:shd w:val="clear" w:color="auto" w:fill="E3F0F4"/>
+            <w:shd w:val="clear" w:color="auto" w:fill="E7E7E7"/>
           </w:tcPr>
           <w:p>
             <w:pPr>
@@ -23061,7 +23046,7 @@
         <w:tc>
           <w:tcPr>
             <w:tcW w:type="dxa" w:w="907"/>
-            <w:shd w:val="clear" w:color="auto" w:fill="E3F0F4"/>
+            <w:shd w:val="clear" w:color="auto" w:fill="E7E7E7"/>
           </w:tcPr>
           <w:p>
             <w:pPr>
@@ -23081,7 +23066,7 @@
         <w:tc>
           <w:tcPr>
             <w:tcW w:type="dxa" w:w="907"/>
-            <w:shd w:val="clear" w:color="auto" w:fill="E3F0F4"/>
+            <w:shd w:val="clear" w:color="auto" w:fill="E7E7E7"/>
           </w:tcPr>
           <w:p>
             <w:pPr>
@@ -23101,7 +23086,7 @@
         <w:tc>
           <w:tcPr>
             <w:tcW w:type="dxa" w:w="2098"/>
-            <w:shd w:val="clear" w:color="auto" w:fill="E3F0F4"/>
+            <w:shd w:val="clear" w:color="auto" w:fill="E7E7E7"/>
           </w:tcPr>
           <w:p>
             <w:pPr>
@@ -24633,7 +24618,7 @@
         <w:tc>
           <w:tcPr>
             <w:tcW w:type="dxa" w:w="1701"/>
-            <w:shd w:val="clear" w:color="auto" w:fill="E3F0F4"/>
+            <w:shd w:val="clear" w:color="auto" w:fill="E7E7E7"/>
           </w:tcPr>
           <w:p>
             <w:pPr>
@@ -24653,7 +24638,7 @@
         <w:tc>
           <w:tcPr>
             <w:tcW w:type="dxa" w:w="1304"/>
-            <w:shd w:val="clear" w:color="auto" w:fill="E3F0F4"/>
+            <w:shd w:val="clear" w:color="auto" w:fill="E7E7E7"/>
           </w:tcPr>
           <w:p>
             <w:pPr>
@@ -24673,7 +24658,7 @@
         <w:tc>
           <w:tcPr>
             <w:tcW w:type="dxa" w:w="2154"/>
-            <w:shd w:val="clear" w:color="auto" w:fill="E3F0F4"/>
+            <w:shd w:val="clear" w:color="auto" w:fill="E7E7E7"/>
           </w:tcPr>
           <w:p>
             <w:pPr>
@@ -24693,7 +24678,7 @@
         <w:tc>
           <w:tcPr>
             <w:tcW w:type="dxa" w:w="907"/>
-            <w:shd w:val="clear" w:color="auto" w:fill="E3F0F4"/>
+            <w:shd w:val="clear" w:color="auto" w:fill="E7E7E7"/>
           </w:tcPr>
           <w:p>
             <w:pPr>
@@ -24713,7 +24698,7 @@
         <w:tc>
           <w:tcPr>
             <w:tcW w:type="dxa" w:w="907"/>
-            <w:shd w:val="clear" w:color="auto" w:fill="E3F0F4"/>
+            <w:shd w:val="clear" w:color="auto" w:fill="E7E7E7"/>
           </w:tcPr>
           <w:p>
             <w:pPr>
@@ -24733,7 +24718,7 @@
         <w:tc>
           <w:tcPr>
             <w:tcW w:type="dxa" w:w="2098"/>
-            <w:shd w:val="clear" w:color="auto" w:fill="E3F0F4"/>
+            <w:shd w:val="clear" w:color="auto" w:fill="E7E7E7"/>
           </w:tcPr>
           <w:p>
             <w:pPr>
@@ -26359,7 +26344,7 @@
         <w:tc>
           <w:tcPr>
             <w:tcW w:type="dxa" w:w="1701"/>
-            <w:shd w:val="clear" w:color="auto" w:fill="E3F0F4"/>
+            <w:shd w:val="clear" w:color="auto" w:fill="E7E7E7"/>
           </w:tcPr>
           <w:p>
             <w:pPr>
@@ -26379,7 +26364,7 @@
         <w:tc>
           <w:tcPr>
             <w:tcW w:type="dxa" w:w="1304"/>
-            <w:shd w:val="clear" w:color="auto" w:fill="E3F0F4"/>
+            <w:shd w:val="clear" w:color="auto" w:fill="E7E7E7"/>
           </w:tcPr>
           <w:p>
             <w:pPr>
@@ -26399,7 +26384,7 @@
         <w:tc>
           <w:tcPr>
             <w:tcW w:type="dxa" w:w="2154"/>
-            <w:shd w:val="clear" w:color="auto" w:fill="E3F0F4"/>
+            <w:shd w:val="clear" w:color="auto" w:fill="E7E7E7"/>
           </w:tcPr>
           <w:p>
             <w:pPr>
@@ -26419,7 +26404,7 @@
         <w:tc>
           <w:tcPr>
             <w:tcW w:type="dxa" w:w="907"/>
-            <w:shd w:val="clear" w:color="auto" w:fill="E3F0F4"/>
+            <w:shd w:val="clear" w:color="auto" w:fill="E7E7E7"/>
           </w:tcPr>
           <w:p>
             <w:pPr>
@@ -26439,7 +26424,7 @@
         <w:tc>
           <w:tcPr>
             <w:tcW w:type="dxa" w:w="907"/>
-            <w:shd w:val="clear" w:color="auto" w:fill="E3F0F4"/>
+            <w:shd w:val="clear" w:color="auto" w:fill="E7E7E7"/>
           </w:tcPr>
           <w:p>
             <w:pPr>
@@ -26459,7 +26444,7 @@
         <w:tc>
           <w:tcPr>
             <w:tcW w:type="dxa" w:w="2098"/>
-            <w:shd w:val="clear" w:color="auto" w:fill="E3F0F4"/>
+            <w:shd w:val="clear" w:color="auto" w:fill="E7E7E7"/>
           </w:tcPr>
           <w:p>
             <w:pPr>
@@ -28358,7 +28343,7 @@
         <w:tc>
           <w:tcPr>
             <w:tcW w:type="dxa" w:w="1701"/>
-            <w:shd w:val="clear" w:color="auto" w:fill="E3F0F4"/>
+            <w:shd w:val="clear" w:color="auto" w:fill="E7E7E7"/>
           </w:tcPr>
           <w:p>
             <w:pPr>
@@ -28378,7 +28363,7 @@
         <w:tc>
           <w:tcPr>
             <w:tcW w:type="dxa" w:w="1304"/>
-            <w:shd w:val="clear" w:color="auto" w:fill="E3F0F4"/>
+            <w:shd w:val="clear" w:color="auto" w:fill="E7E7E7"/>
           </w:tcPr>
           <w:p>
             <w:pPr>
@@ -28398,7 +28383,7 @@
         <w:tc>
           <w:tcPr>
             <w:tcW w:type="dxa" w:w="2154"/>
-            <w:shd w:val="clear" w:color="auto" w:fill="E3F0F4"/>
+            <w:shd w:val="clear" w:color="auto" w:fill="E7E7E7"/>
           </w:tcPr>
           <w:p>
             <w:pPr>
@@ -28418,7 +28403,7 @@
         <w:tc>
           <w:tcPr>
             <w:tcW w:type="dxa" w:w="907"/>
-            <w:shd w:val="clear" w:color="auto" w:fill="E3F0F4"/>
+            <w:shd w:val="clear" w:color="auto" w:fill="E7E7E7"/>
           </w:tcPr>
           <w:p>
             <w:pPr>
@@ -28438,7 +28423,7 @@
         <w:tc>
           <w:tcPr>
             <w:tcW w:type="dxa" w:w="907"/>
-            <w:shd w:val="clear" w:color="auto" w:fill="E3F0F4"/>
+            <w:shd w:val="clear" w:color="auto" w:fill="E7E7E7"/>
           </w:tcPr>
           <w:p>
             <w:pPr>
@@ -28458,7 +28443,7 @@
         <w:tc>
           <w:tcPr>
             <w:tcW w:type="dxa" w:w="2098"/>
-            <w:shd w:val="clear" w:color="auto" w:fill="E3F0F4"/>
+            <w:shd w:val="clear" w:color="auto" w:fill="E7E7E7"/>
           </w:tcPr>
           <w:p>
             <w:pPr>
@@ -30017,7 +30002,7 @@
         <w:tc>
           <w:tcPr>
             <w:tcW w:type="dxa" w:w="1701"/>
-            <w:shd w:val="clear" w:color="auto" w:fill="E3F0F4"/>
+            <w:shd w:val="clear" w:color="auto" w:fill="E7E7E7"/>
           </w:tcPr>
           <w:p>
             <w:pPr>
@@ -30037,7 +30022,7 @@
         <w:tc>
           <w:tcPr>
             <w:tcW w:type="dxa" w:w="1304"/>
-            <w:shd w:val="clear" w:color="auto" w:fill="E3F0F4"/>
+            <w:shd w:val="clear" w:color="auto" w:fill="E7E7E7"/>
           </w:tcPr>
           <w:p>
             <w:pPr>
@@ -30057,7 +30042,7 @@
         <w:tc>
           <w:tcPr>
             <w:tcW w:type="dxa" w:w="2154"/>
-            <w:shd w:val="clear" w:color="auto" w:fill="E3F0F4"/>
+            <w:shd w:val="clear" w:color="auto" w:fill="E7E7E7"/>
           </w:tcPr>
           <w:p>
             <w:pPr>
@@ -30077,7 +30062,7 @@
         <w:tc>
           <w:tcPr>
             <w:tcW w:type="dxa" w:w="907"/>
-            <w:shd w:val="clear" w:color="auto" w:fill="E3F0F4"/>
+            <w:shd w:val="clear" w:color="auto" w:fill="E7E7E7"/>
           </w:tcPr>
           <w:p>
             <w:pPr>
@@ -30097,7 +30082,7 @@
         <w:tc>
           <w:tcPr>
             <w:tcW w:type="dxa" w:w="907"/>
-            <w:shd w:val="clear" w:color="auto" w:fill="E3F0F4"/>
+            <w:shd w:val="clear" w:color="auto" w:fill="E7E7E7"/>
           </w:tcPr>
           <w:p>
             <w:pPr>
@@ -30117,7 +30102,7 @@
         <w:tc>
           <w:tcPr>
             <w:tcW w:type="dxa" w:w="2098"/>
-            <w:shd w:val="clear" w:color="auto" w:fill="E3F0F4"/>
+            <w:shd w:val="clear" w:color="auto" w:fill="E7E7E7"/>
           </w:tcPr>
           <w:p>
             <w:pPr>
@@ -30975,7 +30960,8 @@
     </w:p>
     <w:p>
       <w:pPr>
-        <w:jc w:val="both"/>
+        <w:pStyle w:val="ListBullet"/>
+        <w:spacing w:after="60"/>
       </w:pPr>
       <w:r>
         <w:rPr>
@@ -31004,8 +30990,14 @@
           <w:b w:val="0"/>
           <w:i w:val="0"/>
         </w:rPr>
-        <w:t xml:space="preserve"> no DB Browser for SQLite (gratuito, https://sqlitebrowser.org). </w:t>
-      </w:r>
+        <w:t xml:space="preserve"> no DB Browser for SQLite (gratuito, https://sqlitebrowser.org).</w:t>
+      </w:r>
+    </w:p>
+    <w:p>
+      <w:pPr>
+        <w:pStyle w:val="ListBullet"/>
+        <w:spacing w:after="60"/>
+      </w:pPr>
       <w:r>
         <w:rPr>
           <w:b/>
@@ -31033,14 +31025,20 @@
           <w:b w:val="0"/>
           <w:i w:val="0"/>
         </w:rPr>
-        <w:t xml:space="preserve"> (só precisa do Python). </w:t>
-      </w:r>
+        <w:t xml:space="preserve"> (só precisa do Python).</w:t>
+      </w:r>
+    </w:p>
+    <w:p>
+      <w:pPr>
+        <w:pStyle w:val="ListBullet"/>
+        <w:spacing w:after="60"/>
+      </w:pPr>
       <w:r>
         <w:rPr>
           <w:b/>
           <w:i w:val="0"/>
         </w:rPr>
-        <w:t>Testes:</w:t>
+        <w:t>Rodar os testes:</w:t>
       </w:r>
       <w:r>
         <w:rPr>
@@ -31067,28 +31065,22 @@
     </w:p>
     <w:p>
       <w:pPr>
-        <w:jc w:val="both"/>
+        <w:pStyle w:val="ListBullet"/>
+        <w:spacing w:after="60"/>
       </w:pPr>
+      <w:r>
+        <w:rPr>
+          <w:b/>
+          <w:i w:val="0"/>
+        </w:rPr>
+        <w:t>Criar do zero em SQLite:</w:t>
+      </w:r>
       <w:r>
         <w:rPr>
           <w:b w:val="0"/>
           <w:i w:val="0"/>
         </w:rPr>
-        <w:t xml:space="preserve">Criar do zero em </w:t>
-      </w:r>
-      <w:r>
-        <w:rPr>
-          <w:b/>
-          <w:i w:val="0"/>
-        </w:rPr>
-        <w:t>SQLite</w:t>
-      </w:r>
-      <w:r>
-        <w:rPr>
-          <w:b w:val="0"/>
-          <w:i w:val="0"/>
-        </w:rPr>
-        <w:t xml:space="preserve">: </w:t>
+        <w:t xml:space="preserve"> </w:t>
       </w:r>
       <w:r>
         <w:rPr>
@@ -31133,21 +31125,27 @@
           <w:b w:val="0"/>
           <w:i w:val="0"/>
         </w:rPr>
-        <w:t xml:space="preserve">. Criar em </w:t>
-      </w:r>
+        <w:t>.</w:t>
+      </w:r>
+    </w:p>
+    <w:p>
+      <w:pPr>
+        <w:pStyle w:val="ListBullet"/>
+        <w:spacing w:after="60"/>
+      </w:pPr>
       <w:r>
         <w:rPr>
           <w:b/>
           <w:i w:val="0"/>
         </w:rPr>
-        <w:t>PostgreSQL</w:t>
+        <w:t>Criar em PostgreSQL com Docker:</w:t>
       </w:r>
       <w:r>
         <w:rPr>
           <w:b w:val="0"/>
           <w:i w:val="0"/>
         </w:rPr>
-        <w:t xml:space="preserve"> com Docker: </w:t>
+        <w:t xml:space="preserve"> </w:t>
       </w:r>
       <w:r>
         <w:rPr>
@@ -31177,7 +31175,27 @@
           <w:b w:val="0"/>
           <w:i w:val="0"/>
         </w:rPr>
-        <w:t xml:space="preserve"> (confere as tabelas, roda o CRUD completo e os testes de integridade). Num PostgreSQL já instalado: </w:t>
+        <w:t xml:space="preserve"> (confere as tabelas, roda o CRUD completo e os testes de integridade).</w:t>
+      </w:r>
+    </w:p>
+    <w:p>
+      <w:pPr>
+        <w:pStyle w:val="ListBullet"/>
+        <w:spacing w:after="60"/>
+      </w:pPr>
+      <w:r>
+        <w:rPr>
+          <w:b/>
+          <w:i w:val="0"/>
+        </w:rPr>
+        <w:t>Criar num PostgreSQL já instalado:</w:t>
+      </w:r>
+      <w:r>
+        <w:rPr>
+          <w:b w:val="0"/>
+          <w:i w:val="0"/>
+        </w:rPr>
+        <w:t xml:space="preserve"> </w:t>
       </w:r>
       <w:r>
         <w:rPr>
@@ -31257,14 +31275,22 @@
     </w:p>
     <w:p>
       <w:pPr>
-        <w:jc w:val="left"/>
+        <w:pStyle w:val="ListBullet"/>
+        <w:spacing w:after="60"/>
       </w:pPr>
+      <w:r>
+        <w:rPr>
+          <w:b/>
+          <w:i w:val="0"/>
+        </w:rPr>
+        <w:t>Regerar os arquivos a partir do modelo:</w:t>
+      </w:r>
       <w:r>
         <w:rPr>
           <w:b w:val="0"/>
           <w:i w:val="0"/>
         </w:rPr>
-        <w:t xml:space="preserve">Para regerar todos os arquivos a partir do modelo: </w:t>
+        <w:t xml:space="preserve"> </w:t>
       </w:r>
       <w:r>
         <w:rPr>
@@ -31279,13 +31305,29 @@
           <w:b w:val="0"/>
           <w:i w:val="0"/>
         </w:rPr>
-        <w:t>.</w:t>
+        <w:t xml:space="preserve"> (SQL, banco e dicionário) e </w:t>
+      </w:r>
+      <w:r>
+        <w:rPr>
+          <w:rFonts w:ascii="Consolas" w:hAnsi="Consolas" w:eastAsia="Consolas"/>
+          <w:b w:val="0"/>
+          <w:sz w:val="20"/>
+        </w:rPr>
+        <w:t>python scripts/gerar_der.py</w:t>
+      </w:r>
+      <w:r>
+        <w:rPr>
+          <w:b w:val="0"/>
+          <w:i w:val="0"/>
+        </w:rPr>
+        <w:t xml:space="preserve"> (diagramas).</w:t>
       </w:r>
     </w:p>
     <w:sectPr>
       <w:pgSz w:w="11906" w:h="16838"/>
       <w:pgMar w:top="1701" w:right="1134" w:bottom="1134" w:left="1701" w:header="720" w:footer="720" w:gutter="0"/>
       <w:cols w:space="720"/>
+      <w:titlePg/>
       <w:docGrid w:linePitch="360"/>
     </w:sectPr>
   </w:body>
@@ -31751,7 +31793,7 @@
       <w:rFonts w:asciiTheme="majorHAnsi" w:eastAsiaTheme="majorEastAsia" w:hAnsiTheme="majorHAnsi" w:cstheme="majorBidi" w:ascii="Arial" w:hAnsi="Arial" w:eastAsia="Arial"/>
       <w:b/>
       <w:bCs/>
-      <w:color w:val="17232E"/>
+      <w:color w:val="000000"/>
       <w:sz w:val="30"/>
       <w:szCs w:val="28"/>
     </w:rPr>
@@ -31775,7 +31817,7 @@
       <w:rFonts w:asciiTheme="majorHAnsi" w:eastAsiaTheme="majorEastAsia" w:hAnsiTheme="majorHAnsi" w:cstheme="majorBidi" w:ascii="Arial" w:hAnsi="Arial" w:eastAsia="Arial"/>
       <w:b/>
       <w:bCs/>
-      <w:color w:val="17232E"/>
+      <w:color w:val="000000"/>
       <w:sz w:val="26"/>
       <w:szCs w:val="26"/>
     </w:rPr>
@@ -31799,7 +31841,7 @@
       <w:rFonts w:asciiTheme="majorHAnsi" w:eastAsiaTheme="majorEastAsia" w:hAnsiTheme="majorHAnsi" w:cstheme="majorBidi" w:ascii="Arial" w:hAnsi="Arial" w:eastAsia="Arial"/>
       <w:b/>
       <w:bCs/>
-      <w:color w:val="17232E"/>
+      <w:color w:val="000000"/>
       <w:sz w:val="24"/>
     </w:rPr>
   </w:style>

</xml_diff>